<commit_message>
docs(scoria): fix review findings on the v0.8 book and cross-doc consistency
Final-review findings, one pass:
- C1: the published book's cover and per-page footer read '0.7 / June 13,
  2026' because scoria_has_styles.yaml hardcoded them; regenerate with the
  corrected yaml (0.8, October 3 2026). Gate strengthened: page 1 must show
  the new rev and the whole PDF must not contain the old one.
- I1: the HAS called scoria the family's 'third member' while the new PRD
  says second; the HAS was wrong (andesite is planned, not existing).
- I2: the cross-area vault rollup still said scoria has 'no RTL yet'.
- folded in: the generator's own metadata said DDR2/LPDDR2 and its default
  REV was 0.7, so a bare rerun would have re-created the v0.7 files.
</commit_message>
<xml_diff>
--- a/projects/components/mem-ctrl-ip/scoria-ddr3-lpddr3/docs/DDR3_LPDDR3_HAS_v0.8.docx
+++ b/projects/components/mem-ctrl-ip/scoria-ddr3-lpddr3/docs/DDR3_LPDDR3_HAS_v0.8.docx
@@ -83,7 +83,7 @@
           <w:color w:val="000000"/>
           <w:sz w:val="40"/>
         </w:rPr>
-        <w:t>DDR3 / LPDDR3 Family Controller Hardware Architecture Specification 0.7</w:t>
+        <w:t>DDR3 / LPDDR3 Family Controller Hardware Architecture Specification 0.8</w:t>
       </w:r>
     </w:p>
     <w:p>
@@ -101,7 +101,7 @@
           <w:color w:val="000000"/>
           <w:sz w:val="20"/>
         </w:rPr>
-        <w:t>June 13, 2026</w:t>
+        <w:t>October 3, 2026</w:t>
       </w:r>
     </w:p>
     <w:p>
@@ -160,7 +160,7 @@
             </w:rPr>
             <w:fldChar w:fldCharType="separate"/>
           </w:r>
-          <w:hyperlink w:anchor="__RefHeading___Toc7130_39574736">
+          <w:hyperlink w:anchor="__RefHeading___Toc7132_2498676937">
             <w:r>
               <w:rPr>
                 <w:webHidden/>
@@ -181,7 +181,7 @@
             </w:tabs>
             <w:rPr/>
           </w:pPr>
-          <w:hyperlink w:anchor="__RefHeading___Toc7132_39574736">
+          <w:hyperlink w:anchor="__RefHeading___Toc7134_2498676937">
             <w:r>
               <w:rPr>
                 <w:webHidden/>
@@ -202,7 +202,7 @@
             </w:tabs>
             <w:rPr/>
           </w:pPr>
-          <w:hyperlink w:anchor="__RefHeading___Toc7134_39574736">
+          <w:hyperlink w:anchor="__RefHeading___Toc7136_2498676937">
             <w:r>
               <w:rPr>
                 <w:webHidden/>
@@ -223,7 +223,7 @@
             </w:tabs>
             <w:rPr/>
           </w:pPr>
-          <w:hyperlink w:anchor="__RefHeading___Toc7136_39574736">
+          <w:hyperlink w:anchor="__RefHeading___Toc7138_2498676937">
             <w:r>
               <w:rPr>
                 <w:webHidden/>
@@ -244,7 +244,7 @@
             </w:tabs>
             <w:rPr/>
           </w:pPr>
-          <w:hyperlink w:anchor="__RefHeading___Toc7138_39574736">
+          <w:hyperlink w:anchor="__RefHeading___Toc7140_2498676937">
             <w:r>
               <w:rPr>
                 <w:webHidden/>
@@ -265,7 +265,7 @@
             </w:tabs>
             <w:rPr/>
           </w:pPr>
-          <w:hyperlink w:anchor="__RefHeading___Toc7140_39574736">
+          <w:hyperlink w:anchor="__RefHeading___Toc7142_2498676937">
             <w:r>
               <w:rPr>
                 <w:webHidden/>
@@ -286,7 +286,7 @@
             </w:tabs>
             <w:rPr/>
           </w:pPr>
-          <w:hyperlink w:anchor="__RefHeading___Toc7142_39574736">
+          <w:hyperlink w:anchor="__RefHeading___Toc7144_2498676937">
             <w:r>
               <w:rPr>
                 <w:webHidden/>
@@ -307,7 +307,7 @@
             </w:tabs>
             <w:rPr/>
           </w:pPr>
-          <w:hyperlink w:anchor="__RefHeading___Toc7144_39574736">
+          <w:hyperlink w:anchor="__RefHeading___Toc7146_2498676937">
             <w:r>
               <w:rPr>
                 <w:webHidden/>
@@ -328,7 +328,7 @@
             </w:tabs>
             <w:rPr/>
           </w:pPr>
-          <w:hyperlink w:anchor="__RefHeading___Toc7146_39574736">
+          <w:hyperlink w:anchor="__RefHeading___Toc7148_2498676937">
             <w:r>
               <w:rPr>
                 <w:webHidden/>
@@ -349,7 +349,7 @@
             </w:tabs>
             <w:rPr/>
           </w:pPr>
-          <w:hyperlink w:anchor="__RefHeading___Toc7148_39574736">
+          <w:hyperlink w:anchor="__RefHeading___Toc7150_2498676937">
             <w:r>
               <w:rPr>
                 <w:webHidden/>
@@ -370,7 +370,7 @@
             </w:tabs>
             <w:rPr/>
           </w:pPr>
-          <w:hyperlink w:anchor="__RefHeading___Toc7150_39574736">
+          <w:hyperlink w:anchor="__RefHeading___Toc7152_2498676937">
             <w:r>
               <w:rPr>
                 <w:webHidden/>
@@ -391,7 +391,7 @@
             </w:tabs>
             <w:rPr/>
           </w:pPr>
-          <w:hyperlink w:anchor="__RefHeading___Toc7152_39574736">
+          <w:hyperlink w:anchor="__RefHeading___Toc7154_2498676937">
             <w:r>
               <w:rPr>
                 <w:webHidden/>
@@ -412,7 +412,7 @@
             </w:tabs>
             <w:rPr/>
           </w:pPr>
-          <w:hyperlink w:anchor="__RefHeading___Toc7154_39574736">
+          <w:hyperlink w:anchor="__RefHeading___Toc7156_2498676937">
             <w:r>
               <w:rPr>
                 <w:webHidden/>
@@ -433,7 +433,7 @@
             </w:tabs>
             <w:rPr/>
           </w:pPr>
-          <w:hyperlink w:anchor="__RefHeading___Toc7156_39574736">
+          <w:hyperlink w:anchor="__RefHeading___Toc7158_2498676937">
             <w:r>
               <w:rPr>
                 <w:webHidden/>
@@ -454,7 +454,7 @@
             </w:tabs>
             <w:rPr/>
           </w:pPr>
-          <w:hyperlink w:anchor="__RefHeading___Toc7158_39574736">
+          <w:hyperlink w:anchor="__RefHeading___Toc7160_2498676937">
             <w:r>
               <w:rPr>
                 <w:webHidden/>
@@ -475,7 +475,7 @@
             </w:tabs>
             <w:rPr/>
           </w:pPr>
-          <w:hyperlink w:anchor="__RefHeading___Toc7160_39574736">
+          <w:hyperlink w:anchor="__RefHeading___Toc7162_2498676937">
             <w:r>
               <w:rPr>
                 <w:webHidden/>
@@ -496,7 +496,7 @@
             </w:tabs>
             <w:rPr/>
           </w:pPr>
-          <w:hyperlink w:anchor="__RefHeading___Toc7162_39574736">
+          <w:hyperlink w:anchor="__RefHeading___Toc7164_2498676937">
             <w:r>
               <w:rPr>
                 <w:webHidden/>
@@ -517,7 +517,7 @@
             </w:tabs>
             <w:rPr/>
           </w:pPr>
-          <w:hyperlink w:anchor="__RefHeading___Toc7164_39574736">
+          <w:hyperlink w:anchor="__RefHeading___Toc7166_2498676937">
             <w:r>
               <w:rPr>
                 <w:webHidden/>
@@ -538,7 +538,7 @@
             </w:tabs>
             <w:rPr/>
           </w:pPr>
-          <w:hyperlink w:anchor="__RefHeading___Toc7166_39574736">
+          <w:hyperlink w:anchor="__RefHeading___Toc7168_2498676937">
             <w:r>
               <w:rPr>
                 <w:webHidden/>
@@ -559,7 +559,7 @@
             </w:tabs>
             <w:rPr/>
           </w:pPr>
-          <w:hyperlink w:anchor="__RefHeading___Toc7168_39574736">
+          <w:hyperlink w:anchor="__RefHeading___Toc7170_2498676937">
             <w:r>
               <w:rPr>
                 <w:webHidden/>
@@ -580,7 +580,7 @@
             </w:tabs>
             <w:rPr/>
           </w:pPr>
-          <w:hyperlink w:anchor="__RefHeading___Toc7170_39574736">
+          <w:hyperlink w:anchor="__RefHeading___Toc7172_2498676937">
             <w:r>
               <w:rPr>
                 <w:webHidden/>
@@ -601,7 +601,7 @@
             </w:tabs>
             <w:rPr/>
           </w:pPr>
-          <w:hyperlink w:anchor="__RefHeading___Toc7172_39574736">
+          <w:hyperlink w:anchor="__RefHeading___Toc7174_2498676937">
             <w:r>
               <w:rPr>
                 <w:webHidden/>
@@ -622,7 +622,7 @@
             </w:tabs>
             <w:rPr/>
           </w:pPr>
-          <w:hyperlink w:anchor="__RefHeading___Toc7174_39574736">
+          <w:hyperlink w:anchor="__RefHeading___Toc7176_2498676937">
             <w:r>
               <w:rPr>
                 <w:webHidden/>
@@ -643,7 +643,7 @@
             </w:tabs>
             <w:rPr/>
           </w:pPr>
-          <w:hyperlink w:anchor="__RefHeading___Toc7176_39574736">
+          <w:hyperlink w:anchor="__RefHeading___Toc7178_2498676937">
             <w:r>
               <w:rPr>
                 <w:webHidden/>
@@ -664,7 +664,7 @@
             </w:tabs>
             <w:rPr/>
           </w:pPr>
-          <w:hyperlink w:anchor="__RefHeading___Toc7178_39574736">
+          <w:hyperlink w:anchor="__RefHeading___Toc7180_2498676937">
             <w:r>
               <w:rPr>
                 <w:webHidden/>
@@ -685,7 +685,7 @@
             </w:tabs>
             <w:rPr/>
           </w:pPr>
-          <w:hyperlink w:anchor="__RefHeading___Toc7180_39574736">
+          <w:hyperlink w:anchor="__RefHeading___Toc7182_2498676937">
             <w:r>
               <w:rPr>
                 <w:webHidden/>
@@ -706,7 +706,7 @@
             </w:tabs>
             <w:rPr/>
           </w:pPr>
-          <w:hyperlink w:anchor="__RefHeading___Toc7182_39574736">
+          <w:hyperlink w:anchor="__RefHeading___Toc7184_2498676937">
             <w:r>
               <w:rPr>
                 <w:webHidden/>
@@ -727,7 +727,7 @@
             </w:tabs>
             <w:rPr/>
           </w:pPr>
-          <w:hyperlink w:anchor="__RefHeading___Toc7184_39574736">
+          <w:hyperlink w:anchor="__RefHeading___Toc7186_2498676937">
             <w:r>
               <w:rPr>
                 <w:webHidden/>
@@ -748,7 +748,7 @@
             </w:tabs>
             <w:rPr/>
           </w:pPr>
-          <w:hyperlink w:anchor="__RefHeading___Toc7186_39574736">
+          <w:hyperlink w:anchor="__RefHeading___Toc7188_2498676937">
             <w:r>
               <w:rPr>
                 <w:webHidden/>
@@ -769,7 +769,7 @@
             </w:tabs>
             <w:rPr/>
           </w:pPr>
-          <w:hyperlink w:anchor="__RefHeading___Toc7188_39574736">
+          <w:hyperlink w:anchor="__RefHeading___Toc7190_2498676937">
             <w:r>
               <w:rPr>
                 <w:webHidden/>
@@ -790,7 +790,7 @@
             </w:tabs>
             <w:rPr/>
           </w:pPr>
-          <w:hyperlink w:anchor="__RefHeading___Toc7190_39574736">
+          <w:hyperlink w:anchor="__RefHeading___Toc7192_2498676937">
             <w:r>
               <w:rPr>
                 <w:webHidden/>
@@ -811,7 +811,7 @@
             </w:tabs>
             <w:rPr/>
           </w:pPr>
-          <w:hyperlink w:anchor="__RefHeading___Toc7192_39574736">
+          <w:hyperlink w:anchor="__RefHeading___Toc7194_2498676937">
             <w:r>
               <w:rPr>
                 <w:webHidden/>
@@ -832,7 +832,7 @@
             </w:tabs>
             <w:rPr/>
           </w:pPr>
-          <w:hyperlink w:anchor="__RefHeading___Toc7194_39574736">
+          <w:hyperlink w:anchor="__RefHeading___Toc7196_2498676937">
             <w:r>
               <w:rPr>
                 <w:webHidden/>
@@ -853,7 +853,7 @@
             </w:tabs>
             <w:rPr/>
           </w:pPr>
-          <w:hyperlink w:anchor="__RefHeading___Toc7196_39574736">
+          <w:hyperlink w:anchor="__RefHeading___Toc7198_2498676937">
             <w:r>
               <w:rPr>
                 <w:webHidden/>
@@ -874,7 +874,7 @@
             </w:tabs>
             <w:rPr/>
           </w:pPr>
-          <w:hyperlink w:anchor="__RefHeading___Toc7198_39574736">
+          <w:hyperlink w:anchor="__RefHeading___Toc7200_2498676937">
             <w:r>
               <w:rPr>
                 <w:webHidden/>
@@ -895,7 +895,7 @@
             </w:tabs>
             <w:rPr/>
           </w:pPr>
-          <w:hyperlink w:anchor="__RefHeading___Toc7200_39574736">
+          <w:hyperlink w:anchor="__RefHeading___Toc7202_2498676937">
             <w:r>
               <w:rPr>
                 <w:webHidden/>
@@ -916,7 +916,7 @@
             </w:tabs>
             <w:rPr/>
           </w:pPr>
-          <w:hyperlink w:anchor="__RefHeading___Toc7202_39574736">
+          <w:hyperlink w:anchor="__RefHeading___Toc7204_2498676937">
             <w:r>
               <w:rPr>
                 <w:webHidden/>
@@ -937,7 +937,7 @@
             </w:tabs>
             <w:rPr/>
           </w:pPr>
-          <w:hyperlink w:anchor="__RefHeading___Toc7204_39574736">
+          <w:hyperlink w:anchor="__RefHeading___Toc7206_2498676937">
             <w:r>
               <w:rPr>
                 <w:webHidden/>
@@ -958,7 +958,7 @@
             </w:tabs>
             <w:rPr/>
           </w:pPr>
-          <w:hyperlink w:anchor="__RefHeading___Toc7206_39574736">
+          <w:hyperlink w:anchor="__RefHeading___Toc7208_2498676937">
             <w:r>
               <w:rPr>
                 <w:webHidden/>
@@ -979,7 +979,7 @@
             </w:tabs>
             <w:rPr/>
           </w:pPr>
-          <w:hyperlink w:anchor="__RefHeading___Toc7208_39574736">
+          <w:hyperlink w:anchor="__RefHeading___Toc7210_2498676937">
             <w:r>
               <w:rPr>
                 <w:webHidden/>
@@ -1000,7 +1000,7 @@
             </w:tabs>
             <w:rPr/>
           </w:pPr>
-          <w:hyperlink w:anchor="__RefHeading___Toc7210_39574736">
+          <w:hyperlink w:anchor="__RefHeading___Toc7212_2498676937">
             <w:r>
               <w:rPr>
                 <w:webHidden/>
@@ -1021,7 +1021,7 @@
             </w:tabs>
             <w:rPr/>
           </w:pPr>
-          <w:hyperlink w:anchor="__RefHeading___Toc7212_39574736">
+          <w:hyperlink w:anchor="__RefHeading___Toc7214_2498676937">
             <w:r>
               <w:rPr>
                 <w:webHidden/>
@@ -1042,7 +1042,7 @@
             </w:tabs>
             <w:rPr/>
           </w:pPr>
-          <w:hyperlink w:anchor="__RefHeading___Toc7214_39574736">
+          <w:hyperlink w:anchor="__RefHeading___Toc7216_2498676937">
             <w:r>
               <w:rPr>
                 <w:webHidden/>
@@ -1063,7 +1063,7 @@
             </w:tabs>
             <w:rPr/>
           </w:pPr>
-          <w:hyperlink w:anchor="__RefHeading___Toc7216_39574736">
+          <w:hyperlink w:anchor="__RefHeading___Toc7218_2498676937">
             <w:r>
               <w:rPr>
                 <w:webHidden/>
@@ -1084,7 +1084,7 @@
             </w:tabs>
             <w:rPr/>
           </w:pPr>
-          <w:hyperlink w:anchor="__RefHeading___Toc7218_39574736">
+          <w:hyperlink w:anchor="__RefHeading___Toc7220_2498676937">
             <w:r>
               <w:rPr>
                 <w:webHidden/>
@@ -1105,7 +1105,7 @@
             </w:tabs>
             <w:rPr/>
           </w:pPr>
-          <w:hyperlink w:anchor="__RefHeading___Toc7220_39574736">
+          <w:hyperlink w:anchor="__RefHeading___Toc7222_2498676937">
             <w:r>
               <w:rPr>
                 <w:webHidden/>
@@ -1126,7 +1126,7 @@
             </w:tabs>
             <w:rPr/>
           </w:pPr>
-          <w:hyperlink w:anchor="__RefHeading___Toc7222_39574736">
+          <w:hyperlink w:anchor="__RefHeading___Toc7224_2498676937">
             <w:r>
               <w:rPr>
                 <w:webHidden/>
@@ -1147,7 +1147,7 @@
             </w:tabs>
             <w:rPr/>
           </w:pPr>
-          <w:hyperlink w:anchor="__RefHeading___Toc7224_39574736">
+          <w:hyperlink w:anchor="__RefHeading___Toc7226_2498676937">
             <w:r>
               <w:rPr>
                 <w:webHidden/>
@@ -1168,7 +1168,7 @@
             </w:tabs>
             <w:rPr/>
           </w:pPr>
-          <w:hyperlink w:anchor="__RefHeading___Toc7226_39574736">
+          <w:hyperlink w:anchor="__RefHeading___Toc7228_2498676937">
             <w:r>
               <w:rPr>
                 <w:webHidden/>
@@ -1189,7 +1189,7 @@
             </w:tabs>
             <w:rPr/>
           </w:pPr>
-          <w:hyperlink w:anchor="__RefHeading___Toc7228_39574736">
+          <w:hyperlink w:anchor="__RefHeading___Toc7230_2498676937">
             <w:r>
               <w:rPr>
                 <w:webHidden/>
@@ -1210,7 +1210,7 @@
             </w:tabs>
             <w:rPr/>
           </w:pPr>
-          <w:hyperlink w:anchor="__RefHeading___Toc7230_39574736">
+          <w:hyperlink w:anchor="__RefHeading___Toc7232_2498676937">
             <w:r>
               <w:rPr>
                 <w:webHidden/>
@@ -1231,7 +1231,7 @@
             </w:tabs>
             <w:rPr/>
           </w:pPr>
-          <w:hyperlink w:anchor="__RefHeading___Toc7232_39574736">
+          <w:hyperlink w:anchor="__RefHeading___Toc7234_2498676937">
             <w:r>
               <w:rPr>
                 <w:webHidden/>
@@ -1252,7 +1252,7 @@
             </w:tabs>
             <w:rPr/>
           </w:pPr>
-          <w:hyperlink w:anchor="__RefHeading___Toc7234_39574736">
+          <w:hyperlink w:anchor="__RefHeading___Toc7236_2498676937">
             <w:r>
               <w:rPr>
                 <w:webHidden/>
@@ -1273,7 +1273,7 @@
             </w:tabs>
             <w:rPr/>
           </w:pPr>
-          <w:hyperlink w:anchor="__RefHeading___Toc7236_39574736">
+          <w:hyperlink w:anchor="__RefHeading___Toc7238_2498676937">
             <w:r>
               <w:rPr>
                 <w:webHidden/>
@@ -1294,7 +1294,7 @@
             </w:tabs>
             <w:rPr/>
           </w:pPr>
-          <w:hyperlink w:anchor="__RefHeading___Toc7238_39574736">
+          <w:hyperlink w:anchor="__RefHeading___Toc7240_2498676937">
             <w:r>
               <w:rPr>
                 <w:webHidden/>
@@ -1315,7 +1315,7 @@
             </w:tabs>
             <w:rPr/>
           </w:pPr>
-          <w:hyperlink w:anchor="__RefHeading___Toc7240_39574736">
+          <w:hyperlink w:anchor="__RefHeading___Toc7242_2498676937">
             <w:r>
               <w:rPr>
                 <w:webHidden/>
@@ -1336,7 +1336,7 @@
             </w:tabs>
             <w:rPr/>
           </w:pPr>
-          <w:hyperlink w:anchor="__RefHeading___Toc7242_39574736">
+          <w:hyperlink w:anchor="__RefHeading___Toc7244_2498676937">
             <w:r>
               <w:rPr>
                 <w:webHidden/>
@@ -1357,7 +1357,7 @@
             </w:tabs>
             <w:rPr/>
           </w:pPr>
-          <w:hyperlink w:anchor="__RefHeading___Toc7244_39574736">
+          <w:hyperlink w:anchor="__RefHeading___Toc7246_2498676937">
             <w:r>
               <w:rPr>
                 <w:webHidden/>
@@ -1378,7 +1378,7 @@
             </w:tabs>
             <w:rPr/>
           </w:pPr>
-          <w:hyperlink w:anchor="__RefHeading___Toc7246_39574736">
+          <w:hyperlink w:anchor="__RefHeading___Toc7248_2498676937">
             <w:r>
               <w:rPr>
                 <w:webHidden/>
@@ -1399,7 +1399,7 @@
             </w:tabs>
             <w:rPr/>
           </w:pPr>
-          <w:hyperlink w:anchor="__RefHeading___Toc7248_39574736">
+          <w:hyperlink w:anchor="__RefHeading___Toc7250_2498676937">
             <w:r>
               <w:rPr>
                 <w:webHidden/>
@@ -1420,7 +1420,7 @@
             </w:tabs>
             <w:rPr/>
           </w:pPr>
-          <w:hyperlink w:anchor="__RefHeading___Toc7250_39574736">
+          <w:hyperlink w:anchor="__RefHeading___Toc7252_2498676937">
             <w:r>
               <w:rPr>
                 <w:webHidden/>
@@ -1441,7 +1441,7 @@
             </w:tabs>
             <w:rPr/>
           </w:pPr>
-          <w:hyperlink w:anchor="__RefHeading___Toc7252_39574736">
+          <w:hyperlink w:anchor="__RefHeading___Toc7254_2498676937">
             <w:r>
               <w:rPr>
                 <w:webHidden/>
@@ -1462,7 +1462,7 @@
             </w:tabs>
             <w:rPr/>
           </w:pPr>
-          <w:hyperlink w:anchor="__RefHeading___Toc7254_39574736">
+          <w:hyperlink w:anchor="__RefHeading___Toc7256_2498676937">
             <w:r>
               <w:rPr>
                 <w:webHidden/>
@@ -1483,7 +1483,7 @@
             </w:tabs>
             <w:rPr/>
           </w:pPr>
-          <w:hyperlink w:anchor="__RefHeading___Toc7256_39574736">
+          <w:hyperlink w:anchor="__RefHeading___Toc7258_2498676937">
             <w:r>
               <w:rPr>
                 <w:webHidden/>
@@ -1504,7 +1504,7 @@
             </w:tabs>
             <w:rPr/>
           </w:pPr>
-          <w:hyperlink w:anchor="__RefHeading___Toc7258_39574736">
+          <w:hyperlink w:anchor="__RefHeading___Toc7260_2498676937">
             <w:r>
               <w:rPr>
                 <w:webHidden/>
@@ -1525,7 +1525,7 @@
             </w:tabs>
             <w:rPr/>
           </w:pPr>
-          <w:hyperlink w:anchor="__RefHeading___Toc7260_39574736">
+          <w:hyperlink w:anchor="__RefHeading___Toc7262_2498676937">
             <w:r>
               <w:rPr>
                 <w:webHidden/>
@@ -1546,7 +1546,7 @@
             </w:tabs>
             <w:rPr/>
           </w:pPr>
-          <w:hyperlink w:anchor="__RefHeading___Toc7262_39574736">
+          <w:hyperlink w:anchor="__RefHeading___Toc7264_2498676937">
             <w:r>
               <w:rPr>
                 <w:webHidden/>
@@ -1567,7 +1567,7 @@
             </w:tabs>
             <w:rPr/>
           </w:pPr>
-          <w:hyperlink w:anchor="__RefHeading___Toc7264_39574736">
+          <w:hyperlink w:anchor="__RefHeading___Toc7266_2498676937">
             <w:r>
               <w:rPr>
                 <w:webHidden/>
@@ -1588,7 +1588,7 @@
             </w:tabs>
             <w:rPr/>
           </w:pPr>
-          <w:hyperlink w:anchor="__RefHeading___Toc7266_39574736">
+          <w:hyperlink w:anchor="__RefHeading___Toc7268_2498676937">
             <w:r>
               <w:rPr>
                 <w:webHidden/>
@@ -1609,7 +1609,7 @@
             </w:tabs>
             <w:rPr/>
           </w:pPr>
-          <w:hyperlink w:anchor="__RefHeading___Toc7268_39574736">
+          <w:hyperlink w:anchor="__RefHeading___Toc7270_2498676937">
             <w:r>
               <w:rPr>
                 <w:webHidden/>
@@ -1630,7 +1630,7 @@
             </w:tabs>
             <w:rPr/>
           </w:pPr>
-          <w:hyperlink w:anchor="__RefHeading___Toc7270_39574736">
+          <w:hyperlink w:anchor="__RefHeading___Toc7272_2498676937">
             <w:r>
               <w:rPr>
                 <w:webHidden/>
@@ -1651,7 +1651,7 @@
             </w:tabs>
             <w:rPr/>
           </w:pPr>
-          <w:hyperlink w:anchor="__RefHeading___Toc7272_39574736">
+          <w:hyperlink w:anchor="__RefHeading___Toc7274_2498676937">
             <w:r>
               <w:rPr>
                 <w:webHidden/>
@@ -1672,7 +1672,7 @@
             </w:tabs>
             <w:rPr/>
           </w:pPr>
-          <w:hyperlink w:anchor="__RefHeading___Toc7274_39574736">
+          <w:hyperlink w:anchor="__RefHeading___Toc7276_2498676937">
             <w:r>
               <w:rPr>
                 <w:webHidden/>
@@ -1693,7 +1693,7 @@
             </w:tabs>
             <w:rPr/>
           </w:pPr>
-          <w:hyperlink w:anchor="__RefHeading___Toc7276_39574736">
+          <w:hyperlink w:anchor="__RefHeading___Toc7278_2498676937">
             <w:r>
               <w:rPr>
                 <w:webHidden/>
@@ -1714,7 +1714,7 @@
             </w:tabs>
             <w:rPr/>
           </w:pPr>
-          <w:hyperlink w:anchor="__RefHeading___Toc7278_39574736">
+          <w:hyperlink w:anchor="__RefHeading___Toc7280_2498676937">
             <w:r>
               <w:rPr>
                 <w:webHidden/>
@@ -1735,7 +1735,7 @@
             </w:tabs>
             <w:rPr/>
           </w:pPr>
-          <w:hyperlink w:anchor="__RefHeading___Toc7280_39574736">
+          <w:hyperlink w:anchor="__RefHeading___Toc7282_2498676937">
             <w:r>
               <w:rPr>
                 <w:webHidden/>
@@ -1756,7 +1756,7 @@
             </w:tabs>
             <w:rPr/>
           </w:pPr>
-          <w:hyperlink w:anchor="__RefHeading___Toc7282_39574736">
+          <w:hyperlink w:anchor="__RefHeading___Toc7284_2498676937">
             <w:r>
               <w:rPr>
                 <w:webHidden/>
@@ -1777,7 +1777,7 @@
             </w:tabs>
             <w:rPr/>
           </w:pPr>
-          <w:hyperlink w:anchor="__RefHeading___Toc7284_39574736">
+          <w:hyperlink w:anchor="__RefHeading___Toc7286_2498676937">
             <w:r>
               <w:rPr>
                 <w:webHidden/>
@@ -1798,7 +1798,7 @@
             </w:tabs>
             <w:rPr/>
           </w:pPr>
-          <w:hyperlink w:anchor="__RefHeading___Toc7286_39574736">
+          <w:hyperlink w:anchor="__RefHeading___Toc7288_2498676937">
             <w:r>
               <w:rPr>
                 <w:webHidden/>
@@ -1819,7 +1819,7 @@
             </w:tabs>
             <w:rPr/>
           </w:pPr>
-          <w:hyperlink w:anchor="__RefHeading___Toc7288_39574736">
+          <w:hyperlink w:anchor="__RefHeading___Toc7290_2498676937">
             <w:r>
               <w:rPr>
                 <w:webHidden/>
@@ -1840,7 +1840,7 @@
             </w:tabs>
             <w:rPr/>
           </w:pPr>
-          <w:hyperlink w:anchor="__RefHeading___Toc7290_39574736">
+          <w:hyperlink w:anchor="__RefHeading___Toc7292_2498676937">
             <w:r>
               <w:rPr>
                 <w:webHidden/>
@@ -1861,7 +1861,7 @@
             </w:tabs>
             <w:rPr/>
           </w:pPr>
-          <w:hyperlink w:anchor="__RefHeading___Toc7292_39574736">
+          <w:hyperlink w:anchor="__RefHeading___Toc7294_2498676937">
             <w:r>
               <w:rPr>
                 <w:webHidden/>
@@ -1882,7 +1882,7 @@
             </w:tabs>
             <w:rPr/>
           </w:pPr>
-          <w:hyperlink w:anchor="__RefHeading___Toc7294_39574736">
+          <w:hyperlink w:anchor="__RefHeading___Toc7296_2498676937">
             <w:r>
               <w:rPr>
                 <w:webHidden/>
@@ -1903,7 +1903,7 @@
             </w:tabs>
             <w:rPr/>
           </w:pPr>
-          <w:hyperlink w:anchor="__RefHeading___Toc7296_39574736">
+          <w:hyperlink w:anchor="__RefHeading___Toc7298_2498676937">
             <w:r>
               <w:rPr>
                 <w:webHidden/>
@@ -1924,7 +1924,7 @@
             </w:tabs>
             <w:rPr/>
           </w:pPr>
-          <w:hyperlink w:anchor="__RefHeading___Toc7298_39574736">
+          <w:hyperlink w:anchor="__RefHeading___Toc7300_2498676937">
             <w:r>
               <w:rPr>
                 <w:webHidden/>
@@ -1945,7 +1945,7 @@
             </w:tabs>
             <w:rPr/>
           </w:pPr>
-          <w:hyperlink w:anchor="__RefHeading___Toc7300_39574736">
+          <w:hyperlink w:anchor="__RefHeading___Toc7302_2498676937">
             <w:r>
               <w:rPr>
                 <w:webHidden/>
@@ -1966,7 +1966,7 @@
             </w:tabs>
             <w:rPr/>
           </w:pPr>
-          <w:hyperlink w:anchor="__RefHeading___Toc7302_39574736">
+          <w:hyperlink w:anchor="__RefHeading___Toc7304_2498676937">
             <w:r>
               <w:rPr>
                 <w:webHidden/>
@@ -1987,7 +1987,7 @@
             </w:tabs>
             <w:rPr/>
           </w:pPr>
-          <w:hyperlink w:anchor="__RefHeading___Toc7304_39574736">
+          <w:hyperlink w:anchor="__RefHeading___Toc7306_2498676937">
             <w:r>
               <w:rPr>
                 <w:webHidden/>
@@ -2008,7 +2008,7 @@
             </w:tabs>
             <w:rPr/>
           </w:pPr>
-          <w:hyperlink w:anchor="__RefHeading___Toc7306_39574736">
+          <w:hyperlink w:anchor="__RefHeading___Toc7308_2498676937">
             <w:r>
               <w:rPr>
                 <w:webHidden/>
@@ -2029,7 +2029,7 @@
             </w:tabs>
             <w:rPr/>
           </w:pPr>
-          <w:hyperlink w:anchor="__RefHeading___Toc7308_39574736">
+          <w:hyperlink w:anchor="__RefHeading___Toc7310_2498676937">
             <w:r>
               <w:rPr>
                 <w:webHidden/>
@@ -2050,7 +2050,7 @@
             </w:tabs>
             <w:rPr/>
           </w:pPr>
-          <w:hyperlink w:anchor="__RefHeading___Toc7310_39574736">
+          <w:hyperlink w:anchor="__RefHeading___Toc7312_2498676937">
             <w:r>
               <w:rPr>
                 <w:webHidden/>
@@ -2071,7 +2071,7 @@
             </w:tabs>
             <w:rPr/>
           </w:pPr>
-          <w:hyperlink w:anchor="__RefHeading___Toc7312_39574736">
+          <w:hyperlink w:anchor="__RefHeading___Toc7314_2498676937">
             <w:r>
               <w:rPr>
                 <w:webHidden/>
@@ -2092,7 +2092,7 @@
             </w:tabs>
             <w:rPr/>
           </w:pPr>
-          <w:hyperlink w:anchor="__RefHeading___Toc7314_39574736">
+          <w:hyperlink w:anchor="__RefHeading___Toc7316_2498676937">
             <w:r>
               <w:rPr>
                 <w:webHidden/>
@@ -3500,7 +3500,7 @@
         <w:spacing w:before="0" w:after="120"/>
         <w:rPr/>
       </w:pPr>
-      <w:bookmarkStart w:id="2" w:name="__RefHeading___Toc7130_39574736"/>
+      <w:bookmarkStart w:id="2" w:name="__RefHeading___Toc7132_2498676937"/>
       <w:bookmarkEnd w:id="2"/>
       <w:r>
         <w:rPr>
@@ -3638,7 +3638,7 @@
         <w:spacing w:before="360" w:after="120"/>
         <w:rPr/>
       </w:pPr>
-      <w:bookmarkStart w:id="4" w:name="__RefHeading___Toc7132_39574736"/>
+      <w:bookmarkStart w:id="4" w:name="__RefHeading___Toc7134_2498676937"/>
       <w:bookmarkStart w:id="5" w:name="document-information"/>
       <w:bookmarkEnd w:id="4"/>
       <w:r>
@@ -4168,7 +4168,7 @@
         <w:spacing w:before="280" w:after="80"/>
         <w:rPr/>
       </w:pPr>
-      <w:bookmarkStart w:id="7" w:name="__RefHeading___Toc7134_39574736"/>
+      <w:bookmarkStart w:id="7" w:name="__RefHeading___Toc7136_2498676937"/>
       <w:bookmarkEnd w:id="7"/>
       <w:r>
         <w:rPr>
@@ -4932,7 +4932,7 @@
         <w:spacing w:before="280" w:after="80"/>
         <w:rPr/>
       </w:pPr>
-      <w:bookmarkStart w:id="9" w:name="__RefHeading___Toc7136_39574736"/>
+      <w:bookmarkStart w:id="9" w:name="__RefHeading___Toc7138_2498676937"/>
       <w:bookmarkEnd w:id="9"/>
       <w:r>
         <w:rPr>
@@ -5084,7 +5084,7 @@
         <w:spacing w:before="280" w:after="80"/>
         <w:rPr/>
       </w:pPr>
-      <w:bookmarkStart w:id="10" w:name="__RefHeading___Toc7138_39574736"/>
+      <w:bookmarkStart w:id="10" w:name="__RefHeading___Toc7140_2498676937"/>
       <w:bookmarkEnd w:id="10"/>
       <w:r>
         <w:rPr>
@@ -6170,7 +6170,7 @@
         <w:spacing w:before="280" w:after="80"/>
         <w:rPr/>
       </w:pPr>
-      <w:bookmarkStart w:id="13" w:name="__RefHeading___Toc7140_39574736"/>
+      <w:bookmarkStart w:id="13" w:name="__RefHeading___Toc7142_2498676937"/>
       <w:bookmarkEnd w:id="13"/>
       <w:r>
         <w:rPr>
@@ -6334,7 +6334,7 @@
         <w:spacing w:before="360" w:after="120"/>
         <w:rPr/>
       </w:pPr>
-      <w:bookmarkStart w:id="15" w:name="__RefHeading___Toc7142_39574736"/>
+      <w:bookmarkStart w:id="15" w:name="__RefHeading___Toc7144_2498676937"/>
       <w:bookmarkStart w:id="16" w:name="purpose-and-scope"/>
       <w:bookmarkEnd w:id="15"/>
       <w:r>
@@ -6365,7 +6365,7 @@
         <w:spacing w:before="280" w:after="80"/>
         <w:rPr/>
       </w:pPr>
-      <w:bookmarkStart w:id="17" w:name="__RefHeading___Toc7144_39574736"/>
+      <w:bookmarkStart w:id="17" w:name="__RefHeading___Toc7146_2498676937"/>
       <w:bookmarkStart w:id="18" w:name="purpose"/>
       <w:bookmarkEnd w:id="17"/>
       <w:r>
@@ -6396,7 +6396,7 @@
         <w:rPr>
           <w:sz w:val="20"/>
         </w:rPr>
-        <w:t>scoria is a unified, parameterized memory controller for DDR3 SDRAM and LPDDR3 SDRAM, presenting an AXI4 slave to the host and a DFI v3.1 master to the PHY. It is the third member of a family: pumice covers DDR2/LPDDR2 and is built, measured and running on hardware; a DDR4/LPDDR4 controller is planned.</w:t>
+        <w:t>scoria is a unified, parameterized memory controller for DDR3 SDRAM and LPDDR3 SDRAM, presenting an AXI4 slave to the host and a DFI v3.1 master to the PHY. It is the second member of a family: pumice covers DDR2/LPDDR2 and is built, measured and running on hardware; a DDR4/LPDDR4 controller is planned as the third.</w:t>
       </w:r>
     </w:p>
     <w:p>
@@ -6435,7 +6435,7 @@
         <w:spacing w:before="280" w:after="80"/>
         <w:rPr/>
       </w:pPr>
-      <w:bookmarkStart w:id="19" w:name="__RefHeading___Toc7146_39574736"/>
+      <w:bookmarkStart w:id="19" w:name="__RefHeading___Toc7148_2498676937"/>
       <w:bookmarkStart w:id="20" w:name="why-a-delta-specification"/>
       <w:bookmarkEnd w:id="19"/>
       <w:r>
@@ -6596,7 +6596,7 @@
         <w:spacing w:before="280" w:after="80"/>
         <w:rPr/>
       </w:pPr>
-      <w:bookmarkStart w:id="21" w:name="__RefHeading___Toc7148_39574736"/>
+      <w:bookmarkStart w:id="21" w:name="__RefHeading___Toc7150_2498676937"/>
       <w:bookmarkStart w:id="22" w:name="what-is-in-scope"/>
       <w:bookmarkEnd w:id="21"/>
       <w:r>
@@ -6641,7 +6641,7 @@
         <w:spacing w:before="280" w:after="80"/>
         <w:rPr/>
       </w:pPr>
-      <w:bookmarkStart w:id="24" w:name="__RefHeading___Toc7150_39574736"/>
+      <w:bookmarkStart w:id="24" w:name="__RefHeading___Toc7152_2498676937"/>
       <w:bookmarkStart w:id="25" w:name="what-is-out-of-scope"/>
       <w:bookmarkEnd w:id="24"/>
       <w:r>
@@ -6868,7 +6868,7 @@
         <w:spacing w:before="360" w:after="120"/>
         <w:rPr/>
       </w:pPr>
-      <w:bookmarkStart w:id="28" w:name="__RefHeading___Toc7152_39574736"/>
+      <w:bookmarkStart w:id="28" w:name="__RefHeading___Toc7154_2498676937"/>
       <w:bookmarkStart w:id="29" w:name="document-conventions"/>
       <w:bookmarkEnd w:id="28"/>
       <w:r>
@@ -6899,7 +6899,7 @@
         <w:spacing w:before="280" w:after="80"/>
         <w:rPr/>
       </w:pPr>
-      <w:bookmarkStart w:id="30" w:name="__RefHeading___Toc7154_39574736"/>
+      <w:bookmarkStart w:id="30" w:name="__RefHeading___Toc7156_2498676937"/>
       <w:bookmarkEnd w:id="30"/>
       <w:r>
         <w:rPr>
@@ -7377,7 +7377,7 @@
         <w:spacing w:before="280" w:after="80"/>
         <w:rPr/>
       </w:pPr>
-      <w:bookmarkStart w:id="33" w:name="__RefHeading___Toc7156_39574736"/>
+      <w:bookmarkStart w:id="33" w:name="__RefHeading___Toc7158_2498676937"/>
       <w:bookmarkEnd w:id="33"/>
       <w:r>
         <w:rPr>
@@ -7570,7 +7570,7 @@
         <w:spacing w:before="280" w:after="80"/>
         <w:rPr/>
       </w:pPr>
-      <w:bookmarkStart w:id="34" w:name="__RefHeading___Toc7158_39574736"/>
+      <w:bookmarkStart w:id="34" w:name="__RefHeading___Toc7160_2498676937"/>
       <w:bookmarkStart w:id="35" w:name="timing-values"/>
       <w:bookmarkEnd w:id="34"/>
       <w:r>
@@ -7680,7 +7680,7 @@
         <w:spacing w:before="280" w:after="80"/>
         <w:rPr/>
       </w:pPr>
-      <w:bookmarkStart w:id="36" w:name="__RefHeading___Toc7160_39574736"/>
+      <w:bookmarkStart w:id="36" w:name="__RefHeading___Toc7162_2498676937"/>
       <w:bookmarkStart w:id="37" w:name="citations"/>
       <w:bookmarkEnd w:id="36"/>
       <w:r>
@@ -7852,7 +7852,7 @@
         <w:spacing w:before="360" w:after="120"/>
         <w:rPr/>
       </w:pPr>
-      <w:bookmarkStart w:id="40" w:name="__RefHeading___Toc7162_39574736"/>
+      <w:bookmarkStart w:id="40" w:name="__RefHeading___Toc7164_2498676937"/>
       <w:bookmarkStart w:id="41" w:name="definitions-and-acronyms"/>
       <w:bookmarkEnd w:id="40"/>
       <w:r>
@@ -7883,7 +7883,7 @@
         <w:spacing w:before="280" w:after="80"/>
         <w:rPr/>
       </w:pPr>
-      <w:bookmarkStart w:id="42" w:name="__RefHeading___Toc7164_39574736"/>
+      <w:bookmarkStart w:id="42" w:name="__RefHeading___Toc7166_2498676937"/>
       <w:bookmarkStart w:id="43" w:name="interfaces"/>
       <w:bookmarkEnd w:id="42"/>
       <w:r>
@@ -7989,7 +7989,7 @@
         <w:spacing w:before="280" w:after="80"/>
         <w:rPr/>
       </w:pPr>
-      <w:bookmarkStart w:id="44" w:name="__RefHeading___Toc7166_39574736"/>
+      <w:bookmarkStart w:id="44" w:name="__RefHeading___Toc7168_2498676937"/>
       <w:bookmarkEnd w:id="44"/>
       <w:r>
         <w:rPr>
@@ -8983,7 +8983,7 @@
         <w:spacing w:before="280" w:after="80"/>
         <w:rPr/>
       </w:pPr>
-      <w:bookmarkStart w:id="47" w:name="__RefHeading___Toc7168_39574736"/>
+      <w:bookmarkStart w:id="47" w:name="__RefHeading___Toc7170_2498676937"/>
       <w:bookmarkEnd w:id="47"/>
       <w:r>
         <w:rPr>
@@ -9667,7 +9667,7 @@
         <w:spacing w:before="280" w:after="80"/>
         <w:rPr/>
       </w:pPr>
-      <w:bookmarkStart w:id="49" w:name="__RefHeading___Toc7170_39574736"/>
+      <w:bookmarkStart w:id="49" w:name="__RefHeading___Toc7172_2498676937"/>
       <w:bookmarkStart w:id="50" w:name="terms-used-with-a-specific-meaning-here"/>
       <w:bookmarkEnd w:id="49"/>
       <w:r>
@@ -9868,7 +9868,7 @@
         <w:spacing w:before="360" w:after="120"/>
         <w:rPr/>
       </w:pPr>
-      <w:bookmarkStart w:id="53" w:name="__RefHeading___Toc7172_39574736"/>
+      <w:bookmarkStart w:id="53" w:name="__RefHeading___Toc7174_2498676937"/>
       <w:bookmarkStart w:id="54" w:name="scope-and-goals"/>
       <w:bookmarkEnd w:id="53"/>
       <w:r>
@@ -9899,7 +9899,7 @@
         <w:spacing w:before="280" w:after="80"/>
         <w:rPr/>
       </w:pPr>
-      <w:bookmarkStart w:id="55" w:name="__RefHeading___Toc7174_39574736"/>
+      <w:bookmarkStart w:id="55" w:name="__RefHeading___Toc7176_2498676937"/>
       <w:bookmarkStart w:id="56" w:name="what-scoria-is"/>
       <w:bookmarkEnd w:id="55"/>
       <w:r>
@@ -9944,7 +9944,7 @@
         <w:spacing w:before="280" w:after="80"/>
         <w:rPr/>
       </w:pPr>
-      <w:bookmarkStart w:id="58" w:name="__RefHeading___Toc7176_39574736"/>
+      <w:bookmarkStart w:id="58" w:name="__RefHeading___Toc7178_2498676937"/>
       <w:bookmarkStart w:id="59" w:name="goals"/>
       <w:bookmarkEnd w:id="58"/>
       <w:r>
@@ -10092,7 +10092,7 @@
         <w:spacing w:before="280" w:after="80"/>
         <w:rPr/>
       </w:pPr>
-      <w:bookmarkStart w:id="60" w:name="__RefHeading___Toc7178_39574736"/>
+      <w:bookmarkStart w:id="60" w:name="__RefHeading___Toc7180_2498676937"/>
       <w:bookmarkStart w:id="61" w:name="non-goals"/>
       <w:bookmarkEnd w:id="60"/>
       <w:r>
@@ -10197,7 +10197,7 @@
         <w:spacing w:before="280" w:after="80"/>
         <w:rPr/>
       </w:pPr>
-      <w:bookmarkStart w:id="62" w:name="__RefHeading___Toc7180_39574736"/>
+      <w:bookmarkStart w:id="62" w:name="__RefHeading___Toc7182_2498676937"/>
       <w:bookmarkStart w:id="63" w:name="X2bc673119098689eae9b2ad7f01eaedc27671f8"/>
       <w:bookmarkEnd w:id="62"/>
       <w:r>
@@ -10344,7 +10344,7 @@
         <w:spacing w:before="280" w:after="80"/>
         <w:rPr/>
       </w:pPr>
-      <w:bookmarkStart w:id="64" w:name="__RefHeading___Toc7182_39574736"/>
+      <w:bookmarkStart w:id="64" w:name="__RefHeading___Toc7184_2498676937"/>
       <w:bookmarkStart w:id="65" w:name="what-is-genuinely-harder"/>
       <w:bookmarkEnd w:id="64"/>
       <w:r>
@@ -10538,7 +10538,7 @@
         <w:spacing w:before="360" w:after="120"/>
         <w:rPr/>
       </w:pPr>
-      <w:bookmarkStart w:id="68" w:name="__RefHeading___Toc7184_39574736"/>
+      <w:bookmarkStart w:id="68" w:name="__RefHeading___Toc7186_2498676937"/>
       <w:bookmarkStart w:id="69" w:name="block-diagram"/>
       <w:bookmarkEnd w:id="68"/>
       <w:r>
@@ -10569,7 +10569,7 @@
         <w:spacing w:before="280" w:after="80"/>
         <w:rPr/>
       </w:pPr>
-      <w:bookmarkStart w:id="70" w:name="__RefHeading___Toc7186_39574736"/>
+      <w:bookmarkStart w:id="70" w:name="__RefHeading___Toc7188_2498676937"/>
       <w:bookmarkStart w:id="71" w:name="X793e3fa9fd64bf1af7c8e45dbc98e2c52ca770d"/>
       <w:bookmarkEnd w:id="70"/>
       <w:r>
@@ -10609,7 +10609,7 @@
         <w:spacing w:before="200" w:after="80"/>
         <w:rPr/>
       </w:pPr>
-      <w:bookmarkStart w:id="72" w:name="__RefHeading___Toc7188_39574736"/>
+      <w:bookmarkStart w:id="72" w:name="__RefHeading___Toc7190_2498676937"/>
       <w:bookmarkStart w:id="73" w:name="X04b08cfa3a69441f08ee2d5f02208558eb55e1e"/>
       <w:bookmarkStart w:id="74" w:name="_Fig_1_scoria_block_diagram"/>
       <w:bookmarkEnd w:id="72"/>
@@ -10728,7 +10728,7 @@
         <w:spacing w:before="280" w:after="80"/>
         <w:rPr/>
       </w:pPr>
-      <w:bookmarkStart w:id="75" w:name="__RefHeading___Toc7190_39574736"/>
+      <w:bookmarkStart w:id="75" w:name="__RefHeading___Toc7192_2498676937"/>
       <w:bookmarkStart w:id="76" w:name="reading-the-figure"/>
       <w:bookmarkEnd w:id="75"/>
       <w:r>
@@ -11009,7 +11009,7 @@
         <w:spacing w:before="280" w:after="80"/>
         <w:rPr/>
       </w:pPr>
-      <w:bookmarkStart w:id="77" w:name="__RefHeading___Toc7192_39574736"/>
+      <w:bookmarkStart w:id="77" w:name="__RefHeading___Toc7194_2498676937"/>
       <w:bookmarkStart w:id="78" w:name="what-the-figure-deliberately-omits"/>
       <w:bookmarkEnd w:id="77"/>
       <w:r>
@@ -11142,7 +11142,7 @@
         <w:spacing w:before="360" w:after="120"/>
         <w:rPr/>
       </w:pPr>
-      <w:bookmarkStart w:id="81" w:name="__RefHeading___Toc7194_39574736"/>
+      <w:bookmarkStart w:id="81" w:name="__RefHeading___Toc7196_2498676937"/>
       <w:bookmarkStart w:id="82" w:name="module-hierarchy"/>
       <w:bookmarkEnd w:id="81"/>
       <w:r>
@@ -11173,7 +11173,7 @@
         <w:spacing w:before="280" w:after="80"/>
         <w:rPr/>
       </w:pPr>
-      <w:bookmarkStart w:id="83" w:name="__RefHeading___Toc7196_39574736"/>
+      <w:bookmarkStart w:id="83" w:name="__RefHeading___Toc7198_2498676937"/>
       <w:bookmarkEnd w:id="83"/>
       <w:r>
         <w:rPr>
@@ -11238,7 +11238,7 @@
         <w:spacing w:before="200" w:after="80"/>
         <w:rPr/>
       </w:pPr>
-      <w:bookmarkStart w:id="84" w:name="__RefHeading___Toc7198_39574736"/>
+      <w:bookmarkStart w:id="84" w:name="__RefHeading___Toc7200_2498676937"/>
       <w:bookmarkEnd w:id="84"/>
       <w:r>
         <w:rPr>
@@ -11989,7 +11989,7 @@
         <w:spacing w:before="200" w:after="80"/>
         <w:rPr/>
       </w:pPr>
-      <w:bookmarkStart w:id="87" w:name="__RefHeading___Toc7200_39574736"/>
+      <w:bookmarkStart w:id="87" w:name="__RefHeading___Toc7202_2498676937"/>
       <w:bookmarkEnd w:id="87"/>
       <w:r>
         <w:rPr>
@@ -12352,7 +12352,7 @@
         <w:spacing w:before="200" w:after="80"/>
         <w:rPr/>
       </w:pPr>
-      <w:bookmarkStart w:id="88" w:name="__RefHeading___Toc7202_39574736"/>
+      <w:bookmarkStart w:id="88" w:name="__RefHeading___Toc7204_2498676937"/>
       <w:bookmarkEnd w:id="88"/>
       <w:r>
         <w:rPr>
@@ -12885,7 +12885,7 @@
         <w:spacing w:before="200" w:after="80"/>
         <w:rPr/>
       </w:pPr>
-      <w:bookmarkStart w:id="91" w:name="__RefHeading___Toc7204_39574736"/>
+      <w:bookmarkStart w:id="91" w:name="__RefHeading___Toc7206_2498676937"/>
       <w:bookmarkEnd w:id="91"/>
       <w:r>
         <w:rPr>
@@ -13248,7 +13248,7 @@
         <w:spacing w:before="280" w:after="80"/>
         <w:rPr/>
       </w:pPr>
-      <w:bookmarkStart w:id="94" w:name="__RefHeading___Toc7206_39574736"/>
+      <w:bookmarkStart w:id="94" w:name="__RefHeading___Toc7208_2498676937"/>
       <w:bookmarkEnd w:id="94"/>
       <w:r>
         <w:rPr>
@@ -13514,7 +13514,7 @@
         <w:spacing w:before="360" w:after="120"/>
         <w:rPr/>
       </w:pPr>
-      <w:bookmarkStart w:id="96" w:name="__RefHeading___Toc7208_39574736"/>
+      <w:bookmarkStart w:id="96" w:name="__RefHeading___Toc7210_2498676937"/>
       <w:bookmarkStart w:id="97" w:name="the-target-design-point"/>
       <w:bookmarkEnd w:id="96"/>
       <w:r>
@@ -13545,7 +13545,7 @@
         <w:spacing w:before="280" w:after="80"/>
         <w:rPr/>
       </w:pPr>
-      <w:bookmarkStart w:id="98" w:name="__RefHeading___Toc7210_39574736"/>
+      <w:bookmarkStart w:id="98" w:name="__RefHeading___Toc7212_2498676937"/>
       <w:bookmarkStart w:id="99" w:name="named-as-of-v0.5"/>
       <w:bookmarkEnd w:id="98"/>
       <w:r>
@@ -14961,7 +14961,7 @@
         <w:spacing w:before="280" w:after="80"/>
         <w:rPr/>
       </w:pPr>
-      <w:bookmarkStart w:id="101" w:name="__RefHeading___Toc7212_39574736"/>
+      <w:bookmarkStart w:id="101" w:name="__RefHeading___Toc7214_2498676937"/>
       <w:bookmarkStart w:id="102" w:name="what-this-fixes"/>
       <w:bookmarkEnd w:id="101"/>
       <w:r>
@@ -15791,7 +15791,7 @@
         <w:spacing w:before="280" w:after="80"/>
         <w:rPr/>
       </w:pPr>
-      <w:bookmarkStart w:id="104" w:name="__RefHeading___Toc7214_39574736"/>
+      <w:bookmarkStart w:id="104" w:name="__RefHeading___Toc7216_2498676937"/>
       <w:bookmarkStart w:id="105" w:name="the-jedec-timings-for-this-part-and-bin"/>
       <w:bookmarkEnd w:id="104"/>
       <w:r>
@@ -16654,7 +16654,7 @@
         <w:spacing w:before="280" w:after="80"/>
         <w:rPr/>
       </w:pPr>
-      <w:bookmarkStart w:id="107" w:name="__RefHeading___Toc7216_39574736"/>
+      <w:bookmarkStart w:id="107" w:name="__RefHeading___Toc7218_2498676937"/>
       <w:bookmarkStart w:id="108" w:name="what-is-still-open"/>
       <w:bookmarkEnd w:id="107"/>
       <w:r>
@@ -16851,7 +16851,7 @@
         <w:spacing w:before="360" w:after="120"/>
         <w:rPr/>
       </w:pPr>
-      <w:bookmarkStart w:id="111" w:name="__RefHeading___Toc7218_39574736"/>
+      <w:bookmarkStart w:id="111" w:name="__RefHeading___Toc7220_2498676937"/>
       <w:bookmarkStart w:id="112" w:name="X1e77db8cfb37b9aa0808e3465075579e02adecc"/>
       <w:bookmarkEnd w:id="111"/>
       <w:r>
@@ -16882,7 +16882,7 @@
         <w:spacing w:before="280" w:after="80"/>
         <w:rPr/>
       </w:pPr>
-      <w:bookmarkStart w:id="113" w:name="__RefHeading___Toc7220_39574736"/>
+      <w:bookmarkStart w:id="113" w:name="__RefHeading___Toc7222_2498676937"/>
       <w:bookmarkStart w:id="114" w:name="the-inheritance-stated-once"/>
       <w:bookmarkEnd w:id="113"/>
       <w:r>
@@ -16983,7 +16983,7 @@
         <w:spacing w:before="280" w:after="80"/>
         <w:rPr/>
       </w:pPr>
-      <w:bookmarkStart w:id="115" w:name="__RefHeading___Toc7222_39574736"/>
+      <w:bookmarkStart w:id="115" w:name="__RefHeading___Toc7224_2498676937"/>
       <w:bookmarkEnd w:id="115"/>
       <w:r>
         <w:rPr>
@@ -18612,7 +18612,7 @@
         <w:spacing w:before="280" w:after="80"/>
         <w:rPr/>
       </w:pPr>
-      <w:bookmarkStart w:id="118" w:name="__RefHeading___Toc7224_39574736"/>
+      <w:bookmarkStart w:id="118" w:name="__RefHeading___Toc7226_2498676937"/>
       <w:bookmarkEnd w:id="118"/>
       <w:r>
         <w:rPr>
@@ -19839,7 +19839,7 @@
         <w:spacing w:before="360" w:after="120"/>
         <w:rPr/>
       </w:pPr>
-      <w:bookmarkStart w:id="120" w:name="__RefHeading___Toc7226_39574736"/>
+      <w:bookmarkStart w:id="120" w:name="__RefHeading___Toc7228_2498676937"/>
       <w:bookmarkStart w:id="121" w:name="X322a663345c095d213129697650ce74e5336edc"/>
       <w:bookmarkEnd w:id="120"/>
       <w:r>
@@ -19870,7 +19870,7 @@
         <w:spacing w:before="280" w:after="80"/>
         <w:rPr/>
       </w:pPr>
-      <w:bookmarkStart w:id="122" w:name="__RefHeading___Toc7228_39574736"/>
+      <w:bookmarkStart w:id="122" w:name="__RefHeading___Toc7230_2498676937"/>
       <w:bookmarkEnd w:id="122"/>
       <w:r>
         <w:rPr>
@@ -21083,7 +21083,7 @@
         <w:spacing w:before="280" w:after="80"/>
         <w:rPr/>
       </w:pPr>
-      <w:bookmarkStart w:id="125" w:name="__RefHeading___Toc7230_39574736"/>
+      <w:bookmarkStart w:id="125" w:name="__RefHeading___Toc7232_2498676937"/>
       <w:bookmarkEnd w:id="125"/>
       <w:r>
         <w:rPr>
@@ -21165,7 +21165,7 @@
         <w:spacing w:before="280" w:after="80"/>
         <w:rPr/>
       </w:pPr>
-      <w:bookmarkStart w:id="126" w:name="__RefHeading___Toc7232_39574736"/>
+      <w:bookmarkStart w:id="126" w:name="__RefHeading___Toc7234_2498676937"/>
       <w:bookmarkStart w:id="127" w:name="three-consequences-for-the-sequencer"/>
       <w:bookmarkEnd w:id="126"/>
       <w:r>
@@ -21330,7 +21330,7 @@
         <w:spacing w:before="280" w:after="80"/>
         <w:rPr/>
       </w:pPr>
-      <w:bookmarkStart w:id="128" w:name="__RefHeading___Toc7234_39574736"/>
+      <w:bookmarkStart w:id="128" w:name="__RefHeading___Toc7236_2498676937"/>
       <w:bookmarkStart w:id="129" w:name="zq-calibration"/>
       <w:bookmarkEnd w:id="128"/>
       <w:r>
@@ -21455,7 +21455,7 @@
         <w:spacing w:before="200" w:after="80"/>
         <w:rPr/>
       </w:pPr>
-      <w:bookmarkStart w:id="130" w:name="__RefHeading___Toc7236_39574736"/>
+      <w:bookmarkStart w:id="130" w:name="__RefHeading___Toc7238_2498676937"/>
       <w:bookmarkStart w:id="131" w:name="why-zq-gets-its-own-block"/>
       <w:bookmarkEnd w:id="130"/>
       <w:r>
@@ -21787,7 +21787,7 @@
         <w:spacing w:before="360" w:after="120"/>
         <w:rPr/>
       </w:pPr>
-      <w:bookmarkStart w:id="135" w:name="__RefHeading___Toc7238_39574736"/>
+      <w:bookmarkStart w:id="135" w:name="__RefHeading___Toc7240_2498676937"/>
       <w:bookmarkStart w:id="136" w:name="Xf12a94f6f115163fc645b91d6fa866357947b61"/>
       <w:bookmarkEnd w:id="135"/>
       <w:r>
@@ -21818,7 +21818,7 @@
         <w:spacing w:before="280" w:after="80"/>
         <w:rPr/>
       </w:pPr>
-      <w:bookmarkStart w:id="137" w:name="__RefHeading___Toc7240_39574736"/>
+      <w:bookmarkStart w:id="137" w:name="__RefHeading___Toc7242_2498676937"/>
       <w:bookmarkStart w:id="138" w:name="what-write-leveling-is-for"/>
       <w:bookmarkEnd w:id="137"/>
       <w:r>
@@ -21863,7 +21863,7 @@
         <w:spacing w:before="280" w:after="80"/>
         <w:rPr/>
       </w:pPr>
-      <w:bookmarkStart w:id="140" w:name="__RefHeading___Toc7242_39574736"/>
+      <w:bookmarkStart w:id="140" w:name="__RefHeading___Toc7244_2498676937"/>
       <w:bookmarkStart w:id="141" w:name="X0014f3b073e82ca3263c202e3fe24d8a31c1d66"/>
       <w:bookmarkEnd w:id="140"/>
       <w:r>
@@ -22077,7 +22077,7 @@
         <w:spacing w:before="280" w:after="80"/>
         <w:rPr/>
       </w:pPr>
-      <w:bookmarkStart w:id="142" w:name="__RefHeading___Toc7244_39574736"/>
+      <w:bookmarkStart w:id="142" w:name="__RefHeading___Toc7246_2498676937"/>
       <w:bookmarkEnd w:id="142"/>
       <w:r>
         <w:rPr>
@@ -22715,7 +22715,7 @@
         <w:spacing w:before="280" w:after="80"/>
         <w:rPr/>
       </w:pPr>
-      <w:bookmarkStart w:id="145" w:name="__RefHeading___Toc7246_39574736"/>
+      <w:bookmarkStart w:id="145" w:name="__RefHeading___Toc7248_2498676937"/>
       <w:bookmarkEnd w:id="145"/>
       <w:r>
         <w:rPr>
@@ -23523,7 +23523,7 @@
         <w:spacing w:before="280" w:after="80"/>
         <w:rPr/>
       </w:pPr>
-      <w:bookmarkStart w:id="147" w:name="__RefHeading___Toc7248_39574736"/>
+      <w:bookmarkStart w:id="147" w:name="__RefHeading___Toc7250_2498676937"/>
       <w:bookmarkStart w:id="148" w:name="Xdb45dd4fc6129a8b862c0cd018bdd5b8a50b51b"/>
       <w:bookmarkEnd w:id="147"/>
       <w:r>
@@ -23681,7 +23681,7 @@
         <w:spacing w:before="360" w:after="120"/>
         <w:rPr/>
       </w:pPr>
-      <w:bookmarkStart w:id="151" w:name="__RefHeading___Toc7250_39574736"/>
+      <w:bookmarkStart w:id="151" w:name="__RefHeading___Toc7252_2498676937"/>
       <w:bookmarkStart w:id="152" w:name="Xb52a5c0b77c0c24e0175bac651c7344ea195a2e"/>
       <w:bookmarkEnd w:id="151"/>
       <w:r>
@@ -23712,7 +23712,7 @@
         <w:spacing w:before="280" w:after="80"/>
         <w:rPr/>
       </w:pPr>
-      <w:bookmarkStart w:id="153" w:name="__RefHeading___Toc7252_39574736"/>
+      <w:bookmarkStart w:id="153" w:name="__RefHeading___Toc7254_2498676937"/>
       <w:bookmarkStart w:id="154" w:name="marking-inherited-with-a-mode-select"/>
       <w:bookmarkEnd w:id="153"/>
       <w:r>
@@ -23783,7 +23783,7 @@
         <w:spacing w:before="280" w:after="80"/>
         <w:rPr/>
       </w:pPr>
-      <w:bookmarkStart w:id="155" w:name="__RefHeading___Toc7254_39574736"/>
+      <w:bookmarkStart w:id="155" w:name="__RefHeading___Toc7256_2498676937"/>
       <w:bookmarkStart w:id="156" w:name="what-pumice-already-has"/>
       <w:bookmarkEnd w:id="155"/>
       <w:r>
@@ -23935,7 +23935,7 @@
         <w:spacing w:before="280" w:after="80"/>
         <w:rPr/>
       </w:pPr>
-      <w:bookmarkStart w:id="158" w:name="__RefHeading___Toc7256_39574736"/>
+      <w:bookmarkStart w:id="158" w:name="__RefHeading___Toc7258_2498676937"/>
       <w:bookmarkStart w:id="159" w:name="lpddr3-keeps-the-same-mechanism"/>
       <w:bookmarkEnd w:id="158"/>
       <w:r>
@@ -24039,7 +24039,7 @@
         <w:spacing w:before="280" w:after="80"/>
         <w:rPr/>
       </w:pPr>
-      <w:bookmarkStart w:id="160" w:name="__RefHeading___Toc7258_39574736"/>
+      <w:bookmarkStart w:id="160" w:name="__RefHeading___Toc7260_2498676937"/>
       <w:bookmarkStart w:id="161" w:name="refresh-by-memtype"/>
       <w:bookmarkEnd w:id="160"/>
       <w:r>
@@ -24408,7 +24408,7 @@
         <w:spacing w:before="280" w:after="80"/>
         <w:rPr/>
       </w:pPr>
-      <w:bookmarkStart w:id="164" w:name="__RefHeading___Toc7260_39574736"/>
+      <w:bookmarkStart w:id="164" w:name="__RefHeading___Toc7262_2498676937"/>
       <w:bookmarkStart w:id="165" w:name="requirements"/>
       <w:bookmarkEnd w:id="164"/>
       <w:r>
@@ -24669,7 +24669,7 @@
         <w:spacing w:before="360" w:after="120"/>
         <w:rPr/>
       </w:pPr>
-      <w:bookmarkStart w:id="168" w:name="__RefHeading___Toc7262_39574736"/>
+      <w:bookmarkStart w:id="168" w:name="__RefHeading___Toc7264_2498676937"/>
       <w:bookmarkStart w:id="169" w:name="X673c58e1aa086244c396c20afc94b48e0eeb786"/>
       <w:bookmarkEnd w:id="168"/>
       <w:r>
@@ -24700,7 +24700,7 @@
         <w:spacing w:before="280" w:after="80"/>
         <w:rPr/>
       </w:pPr>
-      <w:bookmarkStart w:id="170" w:name="__RefHeading___Toc7264_39574736"/>
+      <w:bookmarkStart w:id="170" w:name="__RefHeading___Toc7266_2498676937"/>
       <w:bookmarkStart w:id="171" w:name="the-revision-decision"/>
       <w:bookmarkEnd w:id="170"/>
       <w:r>
@@ -24810,7 +24810,7 @@
         <w:spacing w:before="280" w:after="80"/>
         <w:rPr/>
       </w:pPr>
-      <w:bookmarkStart w:id="172" w:name="__RefHeading___Toc7266_39574736"/>
+      <w:bookmarkStart w:id="172" w:name="__RefHeading___Toc7268_2498676937"/>
       <w:bookmarkStart w:id="173" w:name="X4a8c7a8d12f1d6772a63e722ba397eb43d1a178"/>
       <w:bookmarkEnd w:id="172"/>
       <w:r>
@@ -25065,7 +25065,7 @@
         <w:spacing w:before="280" w:after="80"/>
         <w:rPr/>
       </w:pPr>
-      <w:bookmarkStart w:id="175" w:name="__RefHeading___Toc7268_39574736"/>
+      <w:bookmarkStart w:id="175" w:name="__RefHeading___Toc7270_2498676937"/>
       <w:bookmarkStart w:id="176" w:name="what-changes-and-matters"/>
       <w:bookmarkEnd w:id="175"/>
       <w:r>
@@ -25093,7 +25093,7 @@
         <w:spacing w:before="200" w:after="80"/>
         <w:rPr/>
       </w:pPr>
-      <w:bookmarkStart w:id="177" w:name="__RefHeading___Toc7270_39574736"/>
+      <w:bookmarkStart w:id="177" w:name="__RefHeading___Toc7272_2498676937"/>
       <w:bookmarkStart w:id="178" w:name="leveling-reworked-outright"/>
       <w:bookmarkEnd w:id="177"/>
       <w:r>
@@ -25872,7 +25872,7 @@
         <w:spacing w:before="200" w:after="80"/>
         <w:rPr/>
       </w:pPr>
-      <w:bookmarkStart w:id="180" w:name="__RefHeading___Toc7272_39574736"/>
+      <w:bookmarkStart w:id="180" w:name="__RefHeading___Toc7274_2498676937"/>
       <w:bookmarkStart w:id="181" w:name="Xab355cd4f40da0b678e8f915eed33931fe880b1"/>
       <w:bookmarkEnd w:id="180"/>
       <w:r>
@@ -25979,7 +25979,7 @@
         <w:spacing w:before="200" w:after="80"/>
         <w:rPr/>
       </w:pPr>
-      <w:bookmarkStart w:id="182" w:name="__RefHeading___Toc7274_39574736"/>
+      <w:bookmarkStart w:id="182" w:name="__RefHeading___Toc7276_2498676937"/>
       <w:bookmarkStart w:id="183" w:name="initialization-and-errors"/>
       <w:bookmarkEnd w:id="182"/>
       <w:r>
@@ -26079,7 +26079,7 @@
         <w:spacing w:before="200" w:after="80"/>
         <w:rPr/>
       </w:pPr>
-      <w:bookmarkStart w:id="184" w:name="__RefHeading___Toc7276_39574736"/>
+      <w:bookmarkStart w:id="184" w:name="__RefHeading___Toc7278_2498676937"/>
       <w:bookmarkStart w:id="185" w:name="X3371e9ac7e86e7e600562d4a1e058e2a260893e"/>
       <w:bookmarkEnd w:id="184"/>
       <w:r>
@@ -26257,7 +26257,7 @@
         <w:spacing w:before="280" w:after="80"/>
         <w:rPr/>
       </w:pPr>
-      <w:bookmarkStart w:id="186" w:name="__RefHeading___Toc7278_39574736"/>
+      <w:bookmarkStart w:id="186" w:name="__RefHeading___Toc7280_2498676937"/>
       <w:bookmarkStart w:id="187" w:name="what-scoria-does-not-implement"/>
       <w:bookmarkEnd w:id="186"/>
       <w:r>
@@ -27032,7 +27032,7 @@
         <w:spacing w:before="360" w:after="120"/>
         <w:rPr/>
       </w:pPr>
-      <w:bookmarkStart w:id="191" w:name="__RefHeading___Toc7280_39574736"/>
+      <w:bookmarkStart w:id="191" w:name="__RefHeading___Toc7282_2498676937"/>
       <w:bookmarkStart w:id="192" w:name="axi4-slave-and-apb-csr"/>
       <w:bookmarkEnd w:id="191"/>
       <w:r>
@@ -27089,7 +27089,7 @@
         <w:spacing w:before="280" w:after="80"/>
         <w:rPr/>
       </w:pPr>
-      <w:bookmarkStart w:id="193" w:name="__RefHeading___Toc7282_39574736"/>
+      <w:bookmarkStart w:id="193" w:name="__RefHeading___Toc7284_2498676937"/>
       <w:bookmarkStart w:id="194" w:name="axi4-slave"/>
       <w:bookmarkEnd w:id="193"/>
       <w:r>
@@ -27204,7 +27204,7 @@
         <w:spacing w:before="280" w:after="80"/>
         <w:rPr/>
       </w:pPr>
-      <w:bookmarkStart w:id="195" w:name="__RefHeading___Toc7284_39574736"/>
+      <w:bookmarkStart w:id="195" w:name="__RefHeading___Toc7286_2498676937"/>
       <w:bookmarkStart w:id="196" w:name="apb-csr"/>
       <w:bookmarkEnd w:id="195"/>
       <w:r>
@@ -27341,7 +27341,7 @@
         <w:spacing w:before="280" w:after="80"/>
         <w:rPr/>
       </w:pPr>
-      <w:bookmarkStart w:id="197" w:name="__RefHeading___Toc7286_39574736"/>
+      <w:bookmarkStart w:id="197" w:name="__RefHeading___Toc7288_2498676937"/>
       <w:bookmarkStart w:id="198" w:name="X7e8a59554730ce0a24cefdbfee98bb5c7d6d8b0"/>
       <w:bookmarkEnd w:id="197"/>
       <w:r>
@@ -27538,7 +27538,7 @@
         <w:spacing w:before="360" w:after="120"/>
         <w:rPr/>
       </w:pPr>
-      <w:bookmarkStart w:id="201" w:name="__RefHeading___Toc7288_39574736"/>
+      <w:bookmarkStart w:id="201" w:name="__RefHeading___Toc7290_2498676937"/>
       <w:bookmarkStart w:id="202" w:name="scoria_pkg-and-build-time-vs-runtime"/>
       <w:bookmarkEnd w:id="201"/>
       <w:r>
@@ -27569,7 +27569,7 @@
         <w:spacing w:before="280" w:after="80"/>
         <w:rPr/>
       </w:pPr>
-      <w:bookmarkStart w:id="203" w:name="__RefHeading___Toc7290_39574736"/>
+      <w:bookmarkStart w:id="203" w:name="__RefHeading___Toc7292_2498676937"/>
       <w:bookmarkStart w:id="204" w:name="the-package-decision-d3"/>
       <w:bookmarkEnd w:id="203"/>
       <w:r>
@@ -27880,7 +27880,7 @@
         <w:spacing w:before="280" w:after="80"/>
         <w:rPr/>
       </w:pPr>
-      <w:bookmarkStart w:id="205" w:name="__RefHeading___Toc7292_39574736"/>
+      <w:bookmarkStart w:id="205" w:name="__RefHeading___Toc7294_2498676937"/>
       <w:bookmarkStart w:id="206" w:name="X02098df353a6a2d4dc4b0c16fb9b3ba311881da"/>
       <w:bookmarkEnd w:id="205"/>
       <w:r>
@@ -29011,7 +29011,7 @@
         <w:spacing w:before="280" w:after="80"/>
         <w:rPr/>
       </w:pPr>
-      <w:bookmarkStart w:id="208" w:name="__RefHeading___Toc7294_39574736"/>
+      <w:bookmarkStart w:id="208" w:name="__RefHeading___Toc7296_2498676937"/>
       <w:bookmarkStart w:id="209" w:name="new-csr-groups"/>
       <w:bookmarkEnd w:id="208"/>
       <w:r>
@@ -29655,7 +29655,7 @@
         <w:spacing w:before="360" w:after="120"/>
         <w:rPr/>
       </w:pPr>
-      <w:bookmarkStart w:id="213" w:name="__RefHeading___Toc7296_39574736"/>
+      <w:bookmarkStart w:id="213" w:name="__RefHeading___Toc7298_2498676937"/>
       <w:bookmarkStart w:id="214" w:name="Xed9b771463e37213e7e07b65387c20d691537e0"/>
       <w:bookmarkEnd w:id="213"/>
       <w:r>
@@ -29686,7 +29686,7 @@
         <w:spacing w:before="280" w:after="80"/>
         <w:rPr/>
       </w:pPr>
-      <w:bookmarkStart w:id="215" w:name="__RefHeading___Toc7298_39574736"/>
+      <w:bookmarkStart w:id="215" w:name="__RefHeading___Toc7300_2498676937"/>
       <w:bookmarkStart w:id="216" w:name="the-target-is-the-dfi-boundary"/>
       <w:bookmarkEnd w:id="215"/>
       <w:r>
@@ -29790,7 +29790,7 @@
         <w:spacing w:before="280" w:after="80"/>
         <w:rPr/>
       </w:pPr>
-      <w:bookmarkStart w:id="218" w:name="__RefHeading___Toc7300_39574736"/>
+      <w:bookmarkStart w:id="218" w:name="__RefHeading___Toc7302_2498676937"/>
       <w:bookmarkStart w:id="219" w:name="X7c421aaab229b4d61f832bab40844dfee077094"/>
       <w:bookmarkEnd w:id="218"/>
       <w:r>
@@ -30078,7 +30078,7 @@
         <w:spacing w:before="280" w:after="80"/>
         <w:rPr/>
       </w:pPr>
-      <w:bookmarkStart w:id="220" w:name="__RefHeading___Toc7302_39574736"/>
+      <w:bookmarkStart w:id="220" w:name="__RefHeading___Toc7304_2498676937"/>
       <w:bookmarkStart w:id="221" w:name="status-2026-10-03"/>
       <w:bookmarkEnd w:id="220"/>
       <w:r>
@@ -30175,7 +30175,7 @@
         <w:spacing w:before="280" w:after="80"/>
         <w:rPr/>
       </w:pPr>
-      <w:bookmarkStart w:id="223" w:name="__RefHeading___Toc7304_39574736"/>
+      <w:bookmarkStart w:id="223" w:name="__RefHeading___Toc7306_2498676937"/>
       <w:bookmarkStart w:id="224" w:name="question-resolutions-v0.2"/>
       <w:bookmarkEnd w:id="223"/>
       <w:r>
@@ -30961,7 +30961,7 @@
         <w:spacing w:before="200" w:after="80"/>
         <w:rPr/>
       </w:pPr>
-      <w:bookmarkStart w:id="226" w:name="__RefHeading___Toc7306_39574736"/>
+      <w:bookmarkStart w:id="226" w:name="__RefHeading___Toc7308_2498676937"/>
       <w:bookmarkEnd w:id="226"/>
       <w:r>
         <w:rPr>
@@ -31444,7 +31444,7 @@
         <w:spacing w:before="200" w:after="80"/>
         <w:rPr/>
       </w:pPr>
-      <w:bookmarkStart w:id="227" w:name="__RefHeading___Toc7308_39574736"/>
+      <w:bookmarkStart w:id="227" w:name="__RefHeading___Toc7310_2498676937"/>
       <w:bookmarkStart w:id="228" w:name="q2-zqcs-is-a-request-never-a-preemption"/>
       <w:bookmarkEnd w:id="227"/>
       <w:r>
@@ -31750,7 +31750,7 @@
         <w:spacing w:before="200" w:after="80"/>
         <w:rPr/>
       </w:pPr>
-      <w:bookmarkStart w:id="229" w:name="__RefHeading___Toc7310_39574736"/>
+      <w:bookmarkStart w:id="229" w:name="__RefHeading___Toc7312_2498676937"/>
       <w:bookmarkStart w:id="230" w:name="q3-sample-the-prime-dq-bit-only"/>
       <w:bookmarkEnd w:id="229"/>
       <w:r>
@@ -31847,7 +31847,7 @@
         <w:spacing w:before="200" w:after="80"/>
         <w:rPr/>
       </w:pPr>
-      <w:bookmarkStart w:id="231" w:name="__RefHeading___Toc7312_39574736"/>
+      <w:bookmarkStart w:id="231" w:name="__RefHeading___Toc7314_2498676937"/>
       <w:bookmarkStart w:id="232" w:name="q5-struck-rather-than-deferred"/>
       <w:bookmarkEnd w:id="231"/>
       <w:r>
@@ -31943,7 +31943,7 @@
         <w:spacing w:before="280" w:after="80"/>
         <w:rPr/>
       </w:pPr>
-      <w:bookmarkStart w:id="233" w:name="__RefHeading___Toc7314_39574736"/>
+      <w:bookmarkStart w:id="233" w:name="__RefHeading___Toc7316_2498676937"/>
       <w:bookmarkStart w:id="234" w:name="what-would-make-this-a-1.0"/>
       <w:bookmarkEnd w:id="233"/>
       <w:r>
@@ -32136,7 +32136,7 @@
               <w:rFonts w:ascii="Calibri" w:hAnsi="Calibri"/>
               <w:sz w:val="16"/>
             </w:rPr>
-            <w:t>DDR3 / LPDDR3 Family Controller Hardware Architecture Specification 0.7</w:t>
+            <w:t>DDR3 / LPDDR3 Family Controller Hardware Architecture Specification 0.8</w:t>
           </w:r>
         </w:p>
       </w:tc>
@@ -32283,7 +32283,7 @@
               <w:rFonts w:ascii="Calibri" w:hAnsi="Calibri"/>
               <w:sz w:val="16"/>
             </w:rPr>
-            <w:t>DDR3 / LPDDR3 Family Controller Hardware Architecture Specification 0.7</w:t>
+            <w:t>DDR3 / LPDDR3 Family Controller Hardware Architecture Specification 0.8</w:t>
           </w:r>
         </w:p>
       </w:tc>

</xml_diff>